<commit_message>
fix: Alinhando os alertas
</commit_message>
<xml_diff>
--- a/T.I/SÃO PAULO TECH SCHOOL.docx
+++ b/T.I/SÃO PAULO TECH SCHOOL.docx
@@ -226,8 +226,16 @@
     <w:p>
       <w:pPr>
         <w:jc w:val="both"/>
-      </w:pPr>
-      <w:r>
+        <w:rPr>
+          <w:sz w:val="28"/>
+          <w:szCs w:val="28"/>
+        </w:rPr>
+      </w:pPr>
+      <w:r>
+        <w:rPr>
+          <w:sz w:val="28"/>
+          <w:szCs w:val="28"/>
+        </w:rPr>
         <w:t>Compare os 6 maiores lutadores da história e veja qual se enquadra como o melhor de todos os tempos.</w:t>
       </w:r>
     </w:p>
@@ -305,12 +313,16 @@
       <w:pPr>
         <w:pStyle w:val="Ttulo"/>
         <w:rPr>
-          <w:rFonts w:eastAsiaTheme="minorHAnsi"/>
-        </w:rPr>
-      </w:pPr>
-      <w:r>
-        <w:rPr>
-          <w:rFonts w:eastAsiaTheme="minorHAnsi"/>
+          <w:rFonts w:asciiTheme="minorHAnsi" w:eastAsiaTheme="minorHAnsi" w:hAnsiTheme="minorHAnsi" w:cstheme="minorHAnsi"/>
+          <w:sz w:val="32"/>
+          <w:szCs w:val="32"/>
+        </w:rPr>
+      </w:pPr>
+      <w:r>
+        <w:rPr>
+          <w:rFonts w:asciiTheme="minorHAnsi" w:eastAsiaTheme="minorHAnsi" w:hAnsiTheme="minorHAnsi" w:cstheme="minorHAnsi"/>
+          <w:sz w:val="32"/>
+          <w:szCs w:val="32"/>
         </w:rPr>
         <w:t>1. INTRODUÇÃO</w:t>
       </w:r>
@@ -318,16 +330,118 @@
     <w:p>
       <w:pPr>
         <w:jc w:val="both"/>
-      </w:pPr>
-      <w:r>
-        <w:t>O projeto UFC Fighting consiste no desenvolvimento de uma aplicação web interativa voltada para a comparação de lutadores de MMA. O sistema permitirá que usuários realizem comparações entre atletas, visualizem estatísticas e acompanhem um histórico de escolhas.</w:t>
-      </w:r>
-    </w:p>
-    <w:p>
-      <w:pPr>
-        <w:jc w:val="both"/>
-      </w:pPr>
-      <w:r>
+        <w:rPr>
+          <w:sz w:val="28"/>
+          <w:szCs w:val="28"/>
+        </w:rPr>
+      </w:pPr>
+      <w:r>
+        <w:rPr>
+          <w:sz w:val="28"/>
+          <w:szCs w:val="28"/>
+        </w:rPr>
+        <w:t>O projeto UFC Fighting consiste no desenvolvimento de uma aplicação web interativa voltada para a comparação de lutadores de MMA.</w:t>
+      </w:r>
+      <w:r>
+        <w:rPr>
+          <w:sz w:val="28"/>
+          <w:szCs w:val="28"/>
+        </w:rPr>
+        <w:t xml:space="preserve"> Atualmente </w:t>
+      </w:r>
+      <w:r>
+        <w:rPr>
+          <w:sz w:val="28"/>
+          <w:szCs w:val="28"/>
+        </w:rPr>
+        <w:t>na liga UFC é difícil decidir quem é o melhor atleta de todos os tempos</w:t>
+      </w:r>
+      <w:r>
+        <w:rPr>
+          <w:sz w:val="28"/>
+          <w:szCs w:val="28"/>
+        </w:rPr>
+        <w:t>, isso ocorre por conta da diferença de peso dos atletas e da diferença de nível de seus adversários</w:t>
+      </w:r>
+      <w:r>
+        <w:rPr>
+          <w:sz w:val="28"/>
+          <w:szCs w:val="28"/>
+        </w:rPr>
+        <w:t xml:space="preserve">, então o intuído desse projeto é </w:t>
+      </w:r>
+      <w:r>
+        <w:rPr>
+          <w:sz w:val="28"/>
+          <w:szCs w:val="28"/>
+        </w:rPr>
+        <w:t xml:space="preserve">o usuário poder comparar os 6 melhores lutadores de todos os tempos e tomar sua própria decisão </w:t>
+      </w:r>
+      <w:r>
+        <w:rPr>
+          <w:sz w:val="28"/>
+          <w:szCs w:val="28"/>
+        </w:rPr>
+        <w:t>a partir e suas comparações quem é o melhor atleta de todos os tempos</w:t>
+      </w:r>
+      <w:r>
+        <w:rPr>
+          <w:sz w:val="28"/>
+          <w:szCs w:val="28"/>
+        </w:rPr>
+        <w:t>.</w:t>
+      </w:r>
+    </w:p>
+    <w:p>
+      <w:pPr>
+        <w:jc w:val="both"/>
+        <w:rPr>
+          <w:sz w:val="28"/>
+          <w:szCs w:val="28"/>
+        </w:rPr>
+      </w:pPr>
+      <w:r>
+        <w:rPr>
+          <w:sz w:val="28"/>
+          <w:szCs w:val="28"/>
+        </w:rPr>
+        <w:t xml:space="preserve"> O sistema permitirá que usuários realizem comparações entre atletas, visualizem estatísticas</w:t>
+      </w:r>
+      <w:r>
+        <w:rPr>
+          <w:sz w:val="28"/>
+          <w:szCs w:val="28"/>
+        </w:rPr>
+        <w:t xml:space="preserve"> e</w:t>
+      </w:r>
+      <w:r>
+        <w:rPr>
+          <w:sz w:val="28"/>
+          <w:szCs w:val="28"/>
+        </w:rPr>
+        <w:t xml:space="preserve"> acompanhem um histórico de escolhas.</w:t>
+      </w:r>
+      <w:r>
+        <w:rPr>
+          <w:sz w:val="28"/>
+          <w:szCs w:val="28"/>
+        </w:rPr>
+        <w:t xml:space="preserve"> </w:t>
+      </w:r>
+    </w:p>
+    <w:p>
+      <w:pPr>
+        <w:jc w:val="both"/>
+        <w:rPr>
+          <w:sz w:val="28"/>
+          <w:szCs w:val="28"/>
+        </w:rPr>
+      </w:pPr>
+      <w:r>
+        <w:rPr>
+          <w:sz w:val="28"/>
+          <w:szCs w:val="28"/>
+        </w:rPr>
         <w:t>Este documento tem como finalidade descrever o planejamento do projeto, incluindo escopo, objetivos, requisitos, cronograma, riscos e demais elementos essenciais para sua execução, seguindo as boas práticas do PMBOK.</w:t>
       </w:r>
     </w:p>
@@ -344,25 +458,159 @@
     <w:p>
       <w:pPr>
         <w:pStyle w:val="Ttulo"/>
-      </w:pPr>
-      <w:r>
+        <w:rPr>
+          <w:rFonts w:asciiTheme="minorHAnsi" w:hAnsiTheme="minorHAnsi" w:cstheme="minorHAnsi"/>
+          <w:sz w:val="32"/>
+          <w:szCs w:val="32"/>
+        </w:rPr>
+      </w:pPr>
+      <w:r>
+        <w:rPr>
+          <w:rFonts w:asciiTheme="minorHAnsi" w:hAnsiTheme="minorHAnsi" w:cstheme="minorHAnsi"/>
+          <w:sz w:val="32"/>
+          <w:szCs w:val="32"/>
+        </w:rPr>
         <w:t>2. JUSTIFICATIVA</w:t>
       </w:r>
     </w:p>
     <w:p>
       <w:pPr>
         <w:jc w:val="both"/>
-      </w:pPr>
-      <w:r>
-        <w:t>O projeto foi idealizado com o objetivo de aplicar na prática os conhecimentos adquiridos em desenvolvimento web, banco de dados e design de interfaces.</w:t>
-      </w:r>
-    </w:p>
-    <w:p>
-      <w:pPr>
-        <w:jc w:val="both"/>
-      </w:pPr>
-      <w:r>
-        <w:t>Além disso, busca oferecer uma solução simples e interativa para fãs de MMA, permitindo a comparação de lutadores de forma visual e intuitiva.</w:t>
+        <w:rPr>
+          <w:sz w:val="28"/>
+          <w:szCs w:val="28"/>
+        </w:rPr>
+      </w:pPr>
+      <w:r>
+        <w:rPr>
+          <w:sz w:val="28"/>
+          <w:szCs w:val="28"/>
+        </w:rPr>
+        <w:t xml:space="preserve">O projeto foi idealizado com o objetivo de aplicar na prática os conhecimentos adquiridos </w:t>
+      </w:r>
+      <w:r>
+        <w:rPr>
+          <w:sz w:val="28"/>
+          <w:szCs w:val="28"/>
+        </w:rPr>
+        <w:t xml:space="preserve">no primeiro semestre </w:t>
+      </w:r>
+      <w:r>
+        <w:rPr>
+          <w:sz w:val="28"/>
+          <w:szCs w:val="28"/>
+        </w:rPr>
+        <w:t xml:space="preserve">no curso de Ciência da computação nas matérias de </w:t>
+      </w:r>
+      <w:r>
+        <w:rPr>
+          <w:sz w:val="28"/>
+          <w:szCs w:val="28"/>
+        </w:rPr>
+        <w:t xml:space="preserve">Pesquisa e Inovação, Banco de Dados, </w:t>
+      </w:r>
+      <w:r>
+        <w:rPr>
+          <w:sz w:val="28"/>
+          <w:szCs w:val="28"/>
+        </w:rPr>
+        <w:t xml:space="preserve">Arquitetura Computacional, Algoritmos, </w:t>
+      </w:r>
+      <w:r>
+        <w:rPr>
+          <w:sz w:val="28"/>
+          <w:szCs w:val="28"/>
+        </w:rPr>
+        <w:t>Sistemas Operacionais, Tecnologia da Informação</w:t>
+      </w:r>
+      <w:r>
+        <w:rPr>
+          <w:sz w:val="28"/>
+          <w:szCs w:val="28"/>
+        </w:rPr>
+        <w:t xml:space="preserve"> e Socioemocional.</w:t>
+      </w:r>
+    </w:p>
+    <w:p>
+      <w:pPr>
+        <w:jc w:val="both"/>
+        <w:rPr>
+          <w:sz w:val="28"/>
+          <w:szCs w:val="28"/>
+        </w:rPr>
+      </w:pPr>
+      <w:r>
+        <w:rPr>
+          <w:sz w:val="28"/>
+          <w:szCs w:val="28"/>
+        </w:rPr>
+        <w:t xml:space="preserve">Além disso, busca oferecer uma solução simples e interativa para fãs de MMA, </w:t>
+      </w:r>
+      <w:r>
+        <w:rPr>
+          <w:sz w:val="28"/>
+          <w:szCs w:val="28"/>
+        </w:rPr>
+        <w:t xml:space="preserve">para </w:t>
+      </w:r>
+      <w:r>
+        <w:rPr>
+          <w:sz w:val="28"/>
+          <w:szCs w:val="28"/>
+        </w:rPr>
+        <w:t xml:space="preserve">se tornar visual e mensurável a discussão de quem é o melhor atletas de todos os tempos </w:t>
+      </w:r>
+      <w:r>
+        <w:rPr>
+          <w:sz w:val="28"/>
+          <w:szCs w:val="28"/>
+        </w:rPr>
+        <w:t>permitindo a comparação de lutadores de forma visual e intuitiva.</w:t>
+      </w:r>
+    </w:p>
+    <w:p>
+      <w:pPr>
+        <w:jc w:val="both"/>
+        <w:rPr>
+          <w:sz w:val="28"/>
+          <w:szCs w:val="28"/>
+        </w:rPr>
+      </w:pPr>
+      <w:r>
+        <w:rPr>
+          <w:sz w:val="28"/>
+          <w:szCs w:val="28"/>
+        </w:rPr>
+        <w:lastRenderedPageBreak/>
+        <w:t xml:space="preserve">A Justificativa pessoal para a escolha desse tema é minha afinidade com artes márcias e </w:t>
+      </w:r>
+      <w:r>
+        <w:rPr>
+          <w:sz w:val="28"/>
+          <w:szCs w:val="28"/>
+        </w:rPr>
+        <w:t>prática</w:t>
+      </w:r>
+      <w:r>
+        <w:rPr>
+          <w:sz w:val="28"/>
+          <w:szCs w:val="28"/>
+        </w:rPr>
+        <w:t xml:space="preserve"> das mesmas, começando a praticar como esporte com 5 anos de idade</w:t>
+      </w:r>
+      <w:r>
+        <w:rPr>
+          <w:sz w:val="28"/>
+          <w:szCs w:val="28"/>
+        </w:rPr>
+        <w:t xml:space="preserve"> começando com o Judô</w:t>
+      </w:r>
+      <w:r>
+        <w:rPr>
+          <w:sz w:val="28"/>
+          <w:szCs w:val="28"/>
+        </w:rPr>
+        <w:t xml:space="preserve">, com 10 anos indo fazer </w:t>
       </w:r>
     </w:p>
     <w:p>
@@ -373,8 +621,18 @@
     <w:p>
       <w:pPr>
         <w:pStyle w:val="Ttulo"/>
-      </w:pPr>
-      <w:r>
+        <w:rPr>
+          <w:rFonts w:asciiTheme="minorHAnsi" w:hAnsiTheme="minorHAnsi" w:cstheme="minorHAnsi"/>
+          <w:sz w:val="32"/>
+          <w:szCs w:val="32"/>
+        </w:rPr>
+      </w:pPr>
+      <w:r>
+        <w:rPr>
+          <w:rFonts w:asciiTheme="minorHAnsi" w:hAnsiTheme="minorHAnsi" w:cstheme="minorHAnsi"/>
+          <w:sz w:val="32"/>
+          <w:szCs w:val="32"/>
+        </w:rPr>
         <w:t>3. OBJETIVO DO PROJETO</w:t>
       </w:r>
     </w:p>
@@ -510,15 +768,24 @@
         <w:jc w:val="both"/>
       </w:pPr>
       <w:r>
-        <w:lastRenderedPageBreak/>
         <w:t xml:space="preserve">Garantir boa usabilidade e experiência do usuário </w:t>
       </w:r>
     </w:p>
     <w:p>
       <w:pPr>
         <w:pStyle w:val="Ttulo"/>
-      </w:pPr>
-      <w:r>
+        <w:rPr>
+          <w:rFonts w:asciiTheme="minorHAnsi" w:hAnsiTheme="minorHAnsi" w:cstheme="minorHAnsi"/>
+          <w:sz w:val="32"/>
+          <w:szCs w:val="32"/>
+        </w:rPr>
+      </w:pPr>
+      <w:r>
+        <w:rPr>
+          <w:rFonts w:asciiTheme="minorHAnsi" w:hAnsiTheme="minorHAnsi" w:cstheme="minorHAnsi"/>
+          <w:sz w:val="32"/>
+          <w:szCs w:val="32"/>
+        </w:rPr>
         <w:t>4. ESCOPO DO PROJETO</w:t>
       </w:r>
     </w:p>
@@ -707,8 +974,19 @@
     <w:p>
       <w:pPr>
         <w:pStyle w:val="Ttulo"/>
-      </w:pPr>
-      <w:r>
+        <w:rPr>
+          <w:rFonts w:asciiTheme="minorHAnsi" w:hAnsiTheme="minorHAnsi" w:cstheme="minorHAnsi"/>
+          <w:sz w:val="32"/>
+          <w:szCs w:val="32"/>
+        </w:rPr>
+      </w:pPr>
+      <w:r>
+        <w:rPr>
+          <w:rFonts w:asciiTheme="minorHAnsi" w:hAnsiTheme="minorHAnsi" w:cstheme="minorHAnsi"/>
+          <w:sz w:val="32"/>
+          <w:szCs w:val="32"/>
+        </w:rPr>
+        <w:lastRenderedPageBreak/>
         <w:t>6. PARTES INTERESSADAS (STAKEHOLDERS)</w:t>
       </w:r>
     </w:p>
@@ -899,12 +1177,19 @@
     <w:p>
       <w:pPr>
         <w:pStyle w:val="Ttulo"/>
-      </w:pPr>
-      <w:r>
-        <w:t>7.</w:t>
-      </w:r>
-      <w:r>
-        <w:t>PREMISSAS DO PROJETO</w:t>
+        <w:rPr>
+          <w:rFonts w:asciiTheme="minorHAnsi" w:hAnsiTheme="minorHAnsi" w:cstheme="minorHAnsi"/>
+          <w:sz w:val="32"/>
+          <w:szCs w:val="32"/>
+        </w:rPr>
+      </w:pPr>
+      <w:r>
+        <w:rPr>
+          <w:rFonts w:asciiTheme="minorHAnsi" w:hAnsiTheme="minorHAnsi" w:cstheme="minorHAnsi"/>
+          <w:sz w:val="32"/>
+          <w:szCs w:val="32"/>
+        </w:rPr>
+        <w:t>7.PREMISSAS DO PROJETO</w:t>
       </w:r>
     </w:p>
     <w:p>
@@ -920,7 +1205,6 @@
         <w:jc w:val="both"/>
       </w:pPr>
       <w:r>
-        <w:lastRenderedPageBreak/>
         <w:t>Para o projeto UFC Fighting, foram consideradas as seguintes premissas:</w:t>
       </w:r>
     </w:p>
@@ -1036,12 +1320,19 @@
     <w:p>
       <w:pPr>
         <w:pStyle w:val="Ttulo"/>
-      </w:pPr>
-      <w:r>
-        <w:t>8</w:t>
-      </w:r>
-      <w:r>
-        <w:t>. REQUISITOS</w:t>
+        <w:rPr>
+          <w:rFonts w:asciiTheme="minorHAnsi" w:hAnsiTheme="minorHAnsi" w:cstheme="minorHAnsi"/>
+          <w:sz w:val="32"/>
+          <w:szCs w:val="32"/>
+        </w:rPr>
+      </w:pPr>
+      <w:r>
+        <w:rPr>
+          <w:rFonts w:asciiTheme="minorHAnsi" w:hAnsiTheme="minorHAnsi" w:cstheme="minorHAnsi"/>
+          <w:sz w:val="32"/>
+          <w:szCs w:val="32"/>
+        </w:rPr>
+        <w:t>8. REQUISITOS</w:t>
       </w:r>
     </w:p>
     <w:p>
@@ -1137,6 +1428,7 @@
         <w:jc w:val="both"/>
       </w:pPr>
       <w:r>
+        <w:lastRenderedPageBreak/>
         <w:t xml:space="preserve">O sistema deve registrar histórico de comparações </w:t>
       </w:r>
     </w:p>
@@ -1284,7 +1576,6 @@
           <w:b/>
           <w:bCs/>
         </w:rPr>
-        <w:lastRenderedPageBreak/>
         <w:t>9.1</w:t>
       </w:r>
       <w:r>
@@ -1426,36 +1717,12 @@
       <w:pPr>
         <w:ind w:left="360"/>
         <w:jc w:val="both"/>
-        <w:rPr>
-          <w:b/>
-          <w:bCs/>
-        </w:rPr>
-      </w:pPr>
-      <w:r>
-        <w:rPr>
-          <w:b/>
-          <w:bCs/>
-        </w:rPr>
-        <w:t>11</w:t>
-      </w:r>
-      <w:r>
-        <w:rPr>
-          <w:b/>
-          <w:bCs/>
-        </w:rPr>
-        <w:t>. JUSTIFICATIVA DA ESCOLHA DO TEMA</w:t>
-      </w:r>
+      </w:pPr>
     </w:p>
     <w:p>
       <w:pPr>
         <w:ind w:left="360"/>
         <w:jc w:val="both"/>
-      </w:pPr>
-    </w:p>
-    <w:p>
-      <w:pPr>
-        <w:ind w:left="360"/>
-        <w:jc w:val="both"/>
         <w:rPr>
           <w:b/>
           <w:bCs/>
@@ -1536,6 +1803,7 @@
           <w:b/>
           <w:bCs/>
         </w:rPr>
+        <w:lastRenderedPageBreak/>
         <w:t>14.</w:t>
       </w:r>
       <w:r>
@@ -3622,6 +3890,7 @@
   <w:style w:type="character" w:default="1" w:styleId="Fontepargpadro">
     <w:name w:val="Default Paragraph Font"/>
     <w:uiPriority w:val="1"/>
+    <w:semiHidden/>
     <w:unhideWhenUsed/>
   </w:style>
   <w:style w:type="table" w:default="1" w:styleId="Tabelanormal">

</xml_diff>

<commit_message>
feat: back-end comparacoes, ajuste no css da indexDash e front da pagina comparaçoes
</commit_message>
<xml_diff>
--- a/T.I/SÃO PAULO TECH SCHOOL.docx
+++ b/T.I/SÃO PAULO TECH SCHOOL.docx
@@ -134,7 +134,7 @@
                     <pic:cNvPicPr/>
                   </pic:nvPicPr>
                   <pic:blipFill rotWithShape="1">
-                    <a:blip r:embed="rId5" cstate="print">
+                    <a:blip r:embed="rId7" cstate="print">
                       <a:extLst>
                         <a:ext uri="{28A0092B-C50C-407E-A947-70E740481C1C}">
                           <a14:useLocalDpi xmlns:a14="http://schemas.microsoft.com/office/drawing/2010/main" val="0"/>
@@ -383,7 +383,23 @@
           <w:sz w:val="28"/>
           <w:szCs w:val="28"/>
         </w:rPr>
-        <w:t xml:space="preserve">o usuário poder comparar os 6 melhores lutadores de todos os tempos e tomar sua própria decisão </w:t>
+        <w:t xml:space="preserve">o usuário </w:t>
+      </w:r>
+      <w:proofErr w:type="spellStart"/>
+      <w:r>
+        <w:rPr>
+          <w:sz w:val="28"/>
+          <w:szCs w:val="28"/>
+        </w:rPr>
+        <w:t>poder</w:t>
+      </w:r>
+      <w:proofErr w:type="spellEnd"/>
+      <w:r>
+        <w:rPr>
+          <w:sz w:val="28"/>
+          <w:szCs w:val="28"/>
+        </w:rPr>
+        <w:t xml:space="preserve"> comparar os 6 melhores lutadores de todos os tempos e tomar sua própria decisão </w:t>
       </w:r>
       <w:r>
         <w:rPr>
@@ -2028,51 +2044,6 @@
     </w:p>
     <w:p>
       <w:pPr>
-        <w:numPr>
-          <w:ilvl w:val="0"/>
-          <w:numId w:val="6"/>
-        </w:numPr>
-        <w:jc w:val="both"/>
-        <w:rPr>
-          <w:sz w:val="28"/>
-          <w:szCs w:val="28"/>
-        </w:rPr>
-      </w:pPr>
-      <w:r>
-        <w:rPr>
-          <w:sz w:val="28"/>
-          <w:szCs w:val="28"/>
-        </w:rPr>
-        <w:t xml:space="preserve">Layout responsivo </w:t>
-      </w:r>
-    </w:p>
-    <w:p>
-      <w:pPr>
-        <w:numPr>
-          <w:ilvl w:val="0"/>
-          <w:numId w:val="6"/>
-        </w:numPr>
-        <w:jc w:val="both"/>
-        <w:rPr>
-          <w:sz w:val="28"/>
-          <w:szCs w:val="28"/>
-        </w:rPr>
-      </w:pPr>
-      <w:r>
-        <w:rPr>
-          <w:sz w:val="28"/>
-          <w:szCs w:val="28"/>
-        </w:rPr>
-        <w:t>Segurança básica de dados (senha protegida)</w:t>
-      </w:r>
-    </w:p>
-    <w:p>
-      <w:pPr>
-        <w:jc w:val="both"/>
-      </w:pPr>
-    </w:p>
-    <w:p>
-      <w:pPr>
         <w:jc w:val="both"/>
         <w:rPr>
           <w:b/>
@@ -2108,7 +2079,6 @@
           <w:sz w:val="28"/>
           <w:szCs w:val="28"/>
         </w:rPr>
-        <w:lastRenderedPageBreak/>
         <w:t xml:space="preserve">Equipe de desenvolvimento (aluno) </w:t>
       </w:r>
     </w:p>
@@ -2179,6 +2149,7 @@
           <w:sz w:val="28"/>
           <w:szCs w:val="28"/>
         </w:rPr>
+        <w:lastRenderedPageBreak/>
         <w:t xml:space="preserve">Internet </w:t>
       </w:r>
     </w:p>
@@ -2289,22 +2260,6 @@
     </w:p>
     <w:p>
       <w:pPr>
-        <w:ind w:left="360"/>
-        <w:jc w:val="both"/>
-      </w:pPr>
-    </w:p>
-    <w:p>
-      <w:pPr>
-        <w:jc w:val="both"/>
-      </w:pPr>
-    </w:p>
-    <w:p>
-      <w:pPr>
-        <w:jc w:val="both"/>
-      </w:pPr>
-    </w:p>
-    <w:p>
-      <w:pPr>
         <w:jc w:val="both"/>
       </w:pPr>
     </w:p>
@@ -2335,63 +2290,239 @@
         </w:rPr>
         <w:t>. PRINCIPAIS DIFICULDADES</w:t>
       </w:r>
-    </w:p>
-    <w:p>
-      <w:pPr>
-        <w:jc w:val="both"/>
-        <w:rPr>
-          <w:b/>
-          <w:bCs/>
-        </w:rPr>
-      </w:pPr>
-    </w:p>
-    <w:p>
-      <w:pPr>
-        <w:jc w:val="both"/>
-        <w:rPr>
-          <w:b/>
-          <w:bCs/>
-        </w:rPr>
-      </w:pPr>
-      <w:r>
-        <w:rPr>
-          <w:b/>
-          <w:bCs/>
-        </w:rPr>
-        <w:t>14.</w:t>
-      </w:r>
-      <w:r>
-        <w:rPr>
-          <w:b/>
-          <w:bCs/>
-        </w:rPr>
-        <w:t>SUPERAÇÃO E APRENDIZADO</w:t>
-      </w:r>
-    </w:p>
-    <w:p>
-      <w:pPr>
-        <w:jc w:val="both"/>
-      </w:pPr>
-    </w:p>
-    <w:p>
-      <w:pPr>
-        <w:jc w:val="both"/>
-      </w:pPr>
-    </w:p>
-    <w:p>
-      <w:pPr>
-        <w:jc w:val="both"/>
-        <w:rPr>
-          <w:b/>
-          <w:bCs/>
-        </w:rPr>
-      </w:pPr>
-      <w:r>
-        <w:rPr>
-          <w:b/>
-          <w:bCs/>
-        </w:rPr>
-        <w:t>15</w:t>
+      <w:r>
+        <w:rPr>
+          <w:b/>
+          <w:bCs/>
+        </w:rPr>
+        <w:t>/APRENDIZADO</w:t>
+      </w:r>
+    </w:p>
+    <w:p>
+      <w:pPr>
+        <w:jc w:val="both"/>
+        <w:rPr>
+          <w:sz w:val="28"/>
+          <w:szCs w:val="28"/>
+        </w:rPr>
+      </w:pPr>
+      <w:r>
+        <w:rPr>
+          <w:sz w:val="28"/>
+          <w:szCs w:val="28"/>
+        </w:rPr>
+        <w:t xml:space="preserve">As principais dificuldades que eu tive para o desenvolvimento desse site foi a parte de estilização do projeto, é a </w:t>
+      </w:r>
+      <w:r>
+        <w:rPr>
+          <w:sz w:val="28"/>
+          <w:szCs w:val="28"/>
+        </w:rPr>
+        <w:t xml:space="preserve">área que eu apresentei uma maior dificuldade. Já na parte </w:t>
+      </w:r>
+      <w:r>
+        <w:rPr>
+          <w:sz w:val="28"/>
+          <w:szCs w:val="28"/>
+        </w:rPr>
+        <w:t xml:space="preserve">da </w:t>
+      </w:r>
+      <w:r>
+        <w:rPr>
+          <w:sz w:val="28"/>
+          <w:szCs w:val="28"/>
+        </w:rPr>
+        <w:t xml:space="preserve">documentação a maior dificuldade foi a </w:t>
+      </w:r>
+      <w:r>
+        <w:rPr>
+          <w:sz w:val="28"/>
+          <w:szCs w:val="28"/>
+        </w:rPr>
+        <w:t xml:space="preserve">implementação da parte do Socioemocional dentro da documentação não tirando </w:t>
+      </w:r>
+      <w:r>
+        <w:rPr>
+          <w:sz w:val="28"/>
+          <w:szCs w:val="28"/>
+        </w:rPr>
+        <w:t>o conceito</w:t>
+      </w:r>
+      <w:r>
+        <w:rPr>
+          <w:sz w:val="28"/>
+          <w:szCs w:val="28"/>
+        </w:rPr>
+        <w:t xml:space="preserve"> de ser uma documentação de TI</w:t>
+      </w:r>
+      <w:r>
+        <w:rPr>
+          <w:sz w:val="28"/>
+          <w:szCs w:val="28"/>
+        </w:rPr>
+        <w:t xml:space="preserve"> onde eu vou pensar na utilidade do</w:t>
+      </w:r>
+      <w:r>
+        <w:rPr>
+          <w:sz w:val="28"/>
+          <w:szCs w:val="28"/>
+        </w:rPr>
+        <w:t xml:space="preserve"> </w:t>
+      </w:r>
+      <w:r>
+        <w:rPr>
+          <w:sz w:val="28"/>
+          <w:szCs w:val="28"/>
+        </w:rPr>
+        <w:t xml:space="preserve">site para o usuário e ao mesmo tempo </w:t>
+      </w:r>
+      <w:r>
+        <w:rPr>
+          <w:sz w:val="28"/>
+          <w:szCs w:val="28"/>
+        </w:rPr>
+        <w:t xml:space="preserve">atrelar com a importância/ </w:t>
+      </w:r>
+      <w:r>
+        <w:rPr>
+          <w:sz w:val="28"/>
+          <w:szCs w:val="28"/>
+        </w:rPr>
+        <w:t>história</w:t>
+      </w:r>
+      <w:r>
+        <w:rPr>
+          <w:sz w:val="28"/>
+          <w:szCs w:val="28"/>
+        </w:rPr>
+        <w:t xml:space="preserve"> do tema </w:t>
+      </w:r>
+      <w:r>
+        <w:rPr>
+          <w:sz w:val="28"/>
+          <w:szCs w:val="28"/>
+        </w:rPr>
+        <w:t>na minha vida</w:t>
+      </w:r>
+      <w:r>
+        <w:rPr>
+          <w:sz w:val="28"/>
+          <w:szCs w:val="28"/>
+        </w:rPr>
+        <w:t xml:space="preserve">. Na parte do banco de dados, eu não senti dificuldade para fazer as tabelas e as instruções </w:t>
+      </w:r>
+      <w:proofErr w:type="gramStart"/>
+      <w:r>
+        <w:rPr>
+          <w:sz w:val="28"/>
+          <w:szCs w:val="28"/>
+        </w:rPr>
+        <w:t>SQL</w:t>
+      </w:r>
+      <w:proofErr w:type="gramEnd"/>
+      <w:r>
+        <w:rPr>
+          <w:sz w:val="28"/>
+          <w:szCs w:val="28"/>
+        </w:rPr>
+        <w:t xml:space="preserve"> mas na parte da criação das </w:t>
+      </w:r>
+      <w:proofErr w:type="spellStart"/>
+      <w:r>
+        <w:rPr>
+          <w:sz w:val="28"/>
+          <w:szCs w:val="28"/>
+        </w:rPr>
+        <w:t>views</w:t>
+      </w:r>
+      <w:proofErr w:type="spellEnd"/>
+      <w:r>
+        <w:rPr>
+          <w:sz w:val="28"/>
+          <w:szCs w:val="28"/>
+        </w:rPr>
+        <w:t xml:space="preserve"> </w:t>
+      </w:r>
+      <w:r>
+        <w:rPr>
+          <w:sz w:val="28"/>
+          <w:szCs w:val="28"/>
+        </w:rPr>
+        <w:t>por ser um conteúdo novo e não ter uma familiaridade muito grande com essa parte e necessitei da ajuda do professor para essa parte</w:t>
+      </w:r>
+      <w:r>
+        <w:rPr>
+          <w:sz w:val="28"/>
+          <w:szCs w:val="28"/>
+        </w:rPr>
+        <w:t xml:space="preserve"> do desenvolvimento </w:t>
+      </w:r>
+      <w:r>
+        <w:rPr>
+          <w:sz w:val="28"/>
+          <w:szCs w:val="28"/>
+        </w:rPr>
+        <w:t xml:space="preserve">das </w:t>
+      </w:r>
+      <w:proofErr w:type="spellStart"/>
+      <w:r>
+        <w:rPr>
+          <w:sz w:val="28"/>
+          <w:szCs w:val="28"/>
+        </w:rPr>
+        <w:t>views</w:t>
+      </w:r>
+      <w:proofErr w:type="spellEnd"/>
+      <w:r>
+        <w:rPr>
+          <w:sz w:val="28"/>
+          <w:szCs w:val="28"/>
+        </w:rPr>
+        <w:t xml:space="preserve"> e para a validação </w:t>
+      </w:r>
+      <w:proofErr w:type="gramStart"/>
+      <w:r>
+        <w:rPr>
+          <w:sz w:val="28"/>
+          <w:szCs w:val="28"/>
+        </w:rPr>
+        <w:t>da mesma</w:t>
+      </w:r>
+      <w:proofErr w:type="gramEnd"/>
+      <w:r>
+        <w:rPr>
+          <w:sz w:val="28"/>
+          <w:szCs w:val="28"/>
+        </w:rPr>
+        <w:t>.</w:t>
+      </w:r>
+    </w:p>
+    <w:p>
+      <w:pPr>
+        <w:jc w:val="both"/>
+      </w:pPr>
+    </w:p>
+    <w:p>
+      <w:pPr>
+        <w:jc w:val="both"/>
+        <w:rPr>
+          <w:b/>
+          <w:bCs/>
+        </w:rPr>
+      </w:pPr>
+      <w:r>
+        <w:rPr>
+          <w:b/>
+          <w:bCs/>
+        </w:rPr>
+        <w:t>1</w:t>
+      </w:r>
+      <w:r>
+        <w:rPr>
+          <w:b/>
+          <w:bCs/>
+        </w:rPr>
+        <w:t>4</w:t>
       </w:r>
       <w:r>
         <w:rPr>
@@ -2400,6 +2531,267 @@
         </w:rPr>
         <w:t>. AGRADECIMENTOS</w:t>
       </w:r>
+    </w:p>
+    <w:p>
+      <w:pPr>
+        <w:jc w:val="both"/>
+        <w:rPr>
+          <w:b/>
+          <w:bCs/>
+        </w:rPr>
+      </w:pPr>
+      <w:r>
+        <w:rPr>
+          <w:b/>
+          <w:bCs/>
+        </w:rPr>
+        <w:t xml:space="preserve">Nesse projeto eu gostaria de agradecer ao meu pai e minha mãe </w:t>
+      </w:r>
+      <w:r>
+        <w:rPr>
+          <w:b/>
+          <w:bCs/>
+        </w:rPr>
+        <w:t>por sempre me apoiar em tud</w:t>
+      </w:r>
+      <w:r>
+        <w:rPr>
+          <w:b/>
+          <w:bCs/>
+        </w:rPr>
+        <w:t xml:space="preserve">o, me apoiaram nas artes marciais que sempre foi </w:t>
+      </w:r>
+      <w:r>
+        <w:rPr>
+          <w:b/>
+          <w:bCs/>
+        </w:rPr>
+        <w:t xml:space="preserve">o meu </w:t>
+      </w:r>
+      <w:r>
+        <w:rPr>
+          <w:b/>
+          <w:bCs/>
+        </w:rPr>
+        <w:t>hobby</w:t>
+      </w:r>
+      <w:r>
+        <w:rPr>
+          <w:b/>
+          <w:bCs/>
+        </w:rPr>
+        <w:t xml:space="preserve"> e estarem do meu lado não importa a situação, sempre foram superpais para mim, sendo motivo de orgulho e uma fonte de inspiração.</w:t>
+      </w:r>
+    </w:p>
+    <w:p>
+      <w:pPr>
+        <w:jc w:val="both"/>
+        <w:rPr>
+          <w:b/>
+          <w:bCs/>
+        </w:rPr>
+      </w:pPr>
+    </w:p>
+    <w:p>
+      <w:pPr>
+        <w:jc w:val="both"/>
+        <w:rPr>
+          <w:b/>
+          <w:bCs/>
+        </w:rPr>
+      </w:pPr>
+      <w:r>
+        <w:rPr>
+          <w:b/>
+          <w:bCs/>
+        </w:rPr>
+        <w:lastRenderedPageBreak/>
+        <w:t>GITHUB</w:t>
+      </w:r>
+      <w:r>
+        <w:rPr>
+          <w:b/>
+          <w:bCs/>
+        </w:rPr>
+        <w:br/>
+      </w:r>
+      <w:r>
+        <w:rPr>
+          <w:b/>
+          <w:bCs/>
+        </w:rPr>
+        <w:br/>
+      </w:r>
+      <w:r>
+        <w:rPr>
+          <w:b/>
+          <w:bCs/>
+        </w:rPr>
+        <w:drawing>
+          <wp:inline distT="0" distB="0" distL="0" distR="0" wp14:anchorId="1485FD2C" wp14:editId="778E27B9">
+            <wp:extent cx="5400040" cy="2909570"/>
+            <wp:effectExtent l="0" t="0" r="0" b="5080"/>
+            <wp:docPr id="52888094" name="Imagem 1"/>
+            <wp:cNvGraphicFramePr>
+              <a:graphicFrameLocks xmlns:a="http://schemas.openxmlformats.org/drawingml/2006/main" noChangeAspect="1"/>
+            </wp:cNvGraphicFramePr>
+            <a:graphic xmlns:a="http://schemas.openxmlformats.org/drawingml/2006/main">
+              <a:graphicData uri="http://schemas.openxmlformats.org/drawingml/2006/picture">
+                <pic:pic xmlns:pic="http://schemas.openxmlformats.org/drawingml/2006/picture">
+                  <pic:nvPicPr>
+                    <pic:cNvPr id="52888094" name=""/>
+                    <pic:cNvPicPr/>
+                  </pic:nvPicPr>
+                  <pic:blipFill>
+                    <a:blip r:embed="rId8"/>
+                    <a:stretch>
+                      <a:fillRect/>
+                    </a:stretch>
+                  </pic:blipFill>
+                  <pic:spPr>
+                    <a:xfrm>
+                      <a:off x="0" y="0"/>
+                      <a:ext cx="5400040" cy="2909570"/>
+                    </a:xfrm>
+                    <a:prstGeom prst="rect">
+                      <a:avLst/>
+                    </a:prstGeom>
+                  </pic:spPr>
+                </pic:pic>
+              </a:graphicData>
+            </a:graphic>
+          </wp:inline>
+        </w:drawing>
+      </w:r>
+    </w:p>
+    <w:p>
+      <w:pPr>
+        <w:jc w:val="both"/>
+        <w:rPr>
+          <w:b/>
+          <w:bCs/>
+        </w:rPr>
+      </w:pPr>
+    </w:p>
+    <w:p>
+      <w:pPr>
+        <w:jc w:val="both"/>
+        <w:rPr>
+          <w:b/>
+          <w:bCs/>
+        </w:rPr>
+      </w:pPr>
+    </w:p>
+    <w:p>
+      <w:pPr>
+        <w:jc w:val="both"/>
+        <w:rPr>
+          <w:b/>
+          <w:bCs/>
+        </w:rPr>
+      </w:pPr>
+    </w:p>
+    <w:p>
+      <w:pPr>
+        <w:jc w:val="both"/>
+        <w:rPr>
+          <w:b/>
+          <w:bCs/>
+        </w:rPr>
+      </w:pPr>
+    </w:p>
+    <w:p>
+      <w:pPr>
+        <w:jc w:val="both"/>
+        <w:rPr>
+          <w:b/>
+          <w:bCs/>
+        </w:rPr>
+      </w:pPr>
+    </w:p>
+    <w:p>
+      <w:pPr>
+        <w:jc w:val="both"/>
+        <w:rPr>
+          <w:b/>
+          <w:bCs/>
+        </w:rPr>
+      </w:pPr>
+      <w:r>
+        <w:rPr>
+          <w:b/>
+          <w:bCs/>
+        </w:rPr>
+        <w:t>TRELLO</w:t>
+      </w:r>
+    </w:p>
+    <w:p>
+      <w:pPr>
+        <w:jc w:val="both"/>
+        <w:rPr>
+          <w:b/>
+          <w:bCs/>
+        </w:rPr>
+      </w:pPr>
+    </w:p>
+    <w:p>
+      <w:pPr>
+        <w:jc w:val="both"/>
+        <w:rPr>
+          <w:b/>
+          <w:bCs/>
+        </w:rPr>
+      </w:pPr>
+      <w:r>
+        <w:rPr>
+          <w:b/>
+          <w:bCs/>
+        </w:rPr>
+        <w:drawing>
+          <wp:inline distT="0" distB="0" distL="0" distR="0" wp14:anchorId="5FC42584" wp14:editId="775D024B">
+            <wp:extent cx="5400040" cy="2865120"/>
+            <wp:effectExtent l="0" t="0" r="0" b="0"/>
+            <wp:docPr id="200768749" name="Imagem 1"/>
+            <wp:cNvGraphicFramePr>
+              <a:graphicFrameLocks xmlns:a="http://schemas.openxmlformats.org/drawingml/2006/main" noChangeAspect="1"/>
+            </wp:cNvGraphicFramePr>
+            <a:graphic xmlns:a="http://schemas.openxmlformats.org/drawingml/2006/main">
+              <a:graphicData uri="http://schemas.openxmlformats.org/drawingml/2006/picture">
+                <pic:pic xmlns:pic="http://schemas.openxmlformats.org/drawingml/2006/picture">
+                  <pic:nvPicPr>
+                    <pic:cNvPr id="200768749" name=""/>
+                    <pic:cNvPicPr/>
+                  </pic:nvPicPr>
+                  <pic:blipFill>
+                    <a:blip r:embed="rId9"/>
+                    <a:stretch>
+                      <a:fillRect/>
+                    </a:stretch>
+                  </pic:blipFill>
+                  <pic:spPr>
+                    <a:xfrm>
+                      <a:off x="0" y="0"/>
+                      <a:ext cx="5400040" cy="2865120"/>
+                    </a:xfrm>
+                    <a:prstGeom prst="rect">
+                      <a:avLst/>
+                    </a:prstGeom>
+                  </pic:spPr>
+                </pic:pic>
+              </a:graphicData>
+            </a:graphic>
+          </wp:inline>
+        </w:drawing>
+      </w:r>
+    </w:p>
+    <w:p>
+      <w:pPr>
+        <w:jc w:val="both"/>
+        <w:rPr>
+          <w:b/>
+          <w:bCs/>
+        </w:rPr>
+      </w:pPr>
     </w:p>
     <w:p>
       <w:pPr>
@@ -2467,6 +2859,56 @@
     </w:sectPr>
   </w:body>
 </w:document>
+</file>
+
+<file path=word/endnotes.xml><?xml version="1.0" encoding="utf-8"?>
+<w:endnotes xmlns:wpc="http://schemas.microsoft.com/office/word/2010/wordprocessingCanvas" xmlns:cx="http://schemas.microsoft.com/office/drawing/2014/chartex" xmlns:cx1="http://schemas.microsoft.com/office/drawing/2015/9/8/chartex" xmlns:cx2="http://schemas.microsoft.com/office/drawing/2015/10/21/chartex" xmlns:cx3="http://schemas.microsoft.com/office/drawing/2016/5/9/chartex" xmlns:cx4="http://schemas.microsoft.com/office/drawing/2016/5/10/chartex" xmlns:cx5="http://schemas.microsoft.com/office/drawing/2016/5/11/chartex" xmlns:cx6="http://schemas.microsoft.com/office/drawing/2016/5/12/chartex" xmlns:cx7="http://schemas.microsoft.com/office/drawing/2016/5/13/chartex" xmlns:cx8="http://schemas.microsoft.com/office/drawing/2016/5/14/chartex" xmlns:mc="http://schemas.openxmlformats.org/markup-compatibility/2006" xmlns:aink="http://schemas.microsoft.com/office/drawing/2016/ink" xmlns:am3d="http://schemas.microsoft.com/office/drawing/2017/model3d" xmlns:o="urn:schemas-microsoft-com:office:office" xmlns:oel="http://schemas.microsoft.com/office/2019/extlst" xmlns:r="http://schemas.openxmlformats.org/officeDocument/2006/relationships" xmlns:m="http://schemas.openxmlformats.org/officeDocument/2006/math" xmlns:v="urn:schemas-microsoft-com:vml" xmlns:wp14="http://schemas.microsoft.com/office/word/2010/wordprocessingDrawing" xmlns:wp="http://schemas.openxmlformats.org/drawingml/2006/wordprocessingDrawing" xmlns:w10="urn:schemas-microsoft-com:office:word" xmlns:w="http://schemas.openxmlformats.org/wordprocessingml/2006/main" xmlns:w14="http://schemas.microsoft.com/office/word/2010/wordml" xmlns:w15="http://schemas.microsoft.com/office/word/2012/wordml" xmlns:w16cex="http://schemas.microsoft.com/office/word/2018/wordml/cex" xmlns:w16cid="http://schemas.microsoft.com/office/word/2016/wordml/cid" xmlns:w16="http://schemas.microsoft.com/office/word/2018/wordml" xmlns:w16du="http://schemas.microsoft.com/office/word/2023/wordml/word16du" xmlns:w16sdtdh="http://schemas.microsoft.com/office/word/2020/wordml/sdtdatahash" xmlns:w16sdtfl="http://schemas.microsoft.com/office/word/2024/wordml/sdtformatlock" xmlns:w16se="http://schemas.microsoft.com/office/word/2015/wordml/symex" xmlns:wpg="http://schemas.microsoft.com/office/word/2010/wordprocessingGroup" xmlns:wpi="http://schemas.microsoft.com/office/word/2010/wordprocessingInk" xmlns:wne="http://schemas.microsoft.com/office/word/2006/wordml" xmlns:wps="http://schemas.microsoft.com/office/word/2010/wordprocessingShape" mc:Ignorable="w14 w15 w16se w16cid w16 w16cex w16sdtdh w16sdtfl w16du wp14">
+  <w:endnote w:type="separator" w:id="-1">
+    <w:p>
+      <w:pPr>
+        <w:spacing w:after="0" w:line="240" w:lineRule="auto"/>
+      </w:pPr>
+      <w:r>
+        <w:separator/>
+      </w:r>
+    </w:p>
+  </w:endnote>
+  <w:endnote w:type="continuationSeparator" w:id="0">
+    <w:p>
+      <w:pPr>
+        <w:spacing w:after="0" w:line="240" w:lineRule="auto"/>
+      </w:pPr>
+      <w:r>
+        <w:continuationSeparator/>
+      </w:r>
+    </w:p>
+  </w:endnote>
+</w:endnotes>
+</file>
+
+<file path=word/footnotes.xml><?xml version="1.0" encoding="utf-8"?>
+<w:footnotes xmlns:wpc="http://schemas.microsoft.com/office/word/2010/wordprocessingCanvas" xmlns:cx="http://schemas.microsoft.com/office/drawing/2014/chartex" xmlns:cx1="http://schemas.microsoft.com/office/drawing/2015/9/8/chartex" xmlns:cx2="http://schemas.microsoft.com/office/drawing/2015/10/21/chartex" xmlns:cx3="http://schemas.microsoft.com/office/drawing/2016/5/9/chartex" xmlns:cx4="http://schemas.microsoft.com/office/drawing/2016/5/10/chartex" xmlns:cx5="http://schemas.microsoft.com/office/drawing/2016/5/11/chartex" xmlns:cx6="http://schemas.microsoft.com/office/drawing/2016/5/12/chartex" xmlns:cx7="http://schemas.microsoft.com/office/drawing/2016/5/13/chartex" xmlns:cx8="http://schemas.microsoft.com/office/drawing/2016/5/14/chartex" xmlns:mc="http://schemas.openxmlformats.org/markup-compatibility/2006" xmlns:aink="http://schemas.microsoft.com/office/drawing/2016/ink" xmlns:am3d="http://schemas.microsoft.com/office/drawing/2017/model3d" xmlns:o="urn:schemas-microsoft-com:office:office" xmlns:oel="http://schemas.microsoft.com/office/2019/extlst" xmlns:r="http://schemas.openxmlformats.org/officeDocument/2006/relationships" xmlns:m="http://schemas.openxmlformats.org/officeDocument/2006/math" xmlns:v="urn:schemas-microsoft-com:vml" xmlns:wp14="http://schemas.microsoft.com/office/word/2010/wordprocessingDrawing" xmlns:wp="http://schemas.openxmlformats.org/drawingml/2006/wordprocessingDrawing" xmlns:w10="urn:schemas-microsoft-com:office:word" xmlns:w="http://schemas.openxmlformats.org/wordprocessingml/2006/main" xmlns:w14="http://schemas.microsoft.com/office/word/2010/wordml" xmlns:w15="http://schemas.microsoft.com/office/word/2012/wordml" xmlns:w16cex="http://schemas.microsoft.com/office/word/2018/wordml/cex" xmlns:w16cid="http://schemas.microsoft.com/office/word/2016/wordml/cid" xmlns:w16="http://schemas.microsoft.com/office/word/2018/wordml" xmlns:w16du="http://schemas.microsoft.com/office/word/2023/wordml/word16du" xmlns:w16sdtdh="http://schemas.microsoft.com/office/word/2020/wordml/sdtdatahash" xmlns:w16sdtfl="http://schemas.microsoft.com/office/word/2024/wordml/sdtformatlock" xmlns:w16se="http://schemas.microsoft.com/office/word/2015/wordml/symex" xmlns:wpg="http://schemas.microsoft.com/office/word/2010/wordprocessingGroup" xmlns:wpi="http://schemas.microsoft.com/office/word/2010/wordprocessingInk" xmlns:wne="http://schemas.microsoft.com/office/word/2006/wordml" xmlns:wps="http://schemas.microsoft.com/office/word/2010/wordprocessingShape" mc:Ignorable="w14 w15 w16se w16cid w16 w16cex w16sdtdh w16sdtfl w16du wp14">
+  <w:footnote w:type="separator" w:id="-1">
+    <w:p>
+      <w:pPr>
+        <w:spacing w:after="0" w:line="240" w:lineRule="auto"/>
+      </w:pPr>
+      <w:r>
+        <w:separator/>
+      </w:r>
+    </w:p>
+  </w:footnote>
+  <w:footnote w:type="continuationSeparator" w:id="0">
+    <w:p>
+      <w:pPr>
+        <w:spacing w:after="0" w:line="240" w:lineRule="auto"/>
+      </w:pPr>
+      <w:r>
+        <w:continuationSeparator/>
+      </w:r>
+    </w:p>
+  </w:footnote>
+</w:footnotes>
 </file>
 
 <file path=word/numbering.xml><?xml version="1.0" encoding="utf-8"?>
@@ -4757,6 +5199,50 @@
       <w:spacing w:val="5"/>
     </w:rPr>
   </w:style>
+  <w:style w:type="paragraph" w:styleId="Cabealho">
+    <w:name w:val="header"/>
+    <w:basedOn w:val="Normal"/>
+    <w:link w:val="CabealhoChar"/>
+    <w:uiPriority w:val="99"/>
+    <w:unhideWhenUsed/>
+    <w:rsid w:val="00554686"/>
+    <w:pPr>
+      <w:tabs>
+        <w:tab w:val="center" w:pos="4252"/>
+        <w:tab w:val="right" w:pos="8504"/>
+      </w:tabs>
+      <w:spacing w:after="0" w:line="240" w:lineRule="auto"/>
+    </w:pPr>
+  </w:style>
+  <w:style w:type="character" w:customStyle="1" w:styleId="CabealhoChar">
+    <w:name w:val="Cabeçalho Char"/>
+    <w:basedOn w:val="Fontepargpadro"/>
+    <w:link w:val="Cabealho"/>
+    <w:uiPriority w:val="99"/>
+    <w:rsid w:val="00554686"/>
+  </w:style>
+  <w:style w:type="paragraph" w:styleId="Rodap">
+    <w:name w:val="footer"/>
+    <w:basedOn w:val="Normal"/>
+    <w:link w:val="RodapChar"/>
+    <w:uiPriority w:val="99"/>
+    <w:unhideWhenUsed/>
+    <w:rsid w:val="00554686"/>
+    <w:pPr>
+      <w:tabs>
+        <w:tab w:val="center" w:pos="4252"/>
+        <w:tab w:val="right" w:pos="8504"/>
+      </w:tabs>
+      <w:spacing w:after="0" w:line="240" w:lineRule="auto"/>
+    </w:pPr>
+  </w:style>
+  <w:style w:type="character" w:customStyle="1" w:styleId="RodapChar">
+    <w:name w:val="Rodapé Char"/>
+    <w:basedOn w:val="Fontepargpadro"/>
+    <w:link w:val="Rodap"/>
+    <w:uiPriority w:val="99"/>
+    <w:rsid w:val="00554686"/>
+  </w:style>
 </w:styles>
 </file>
 

</xml_diff>